<commit_message>
Publish legal and support policy pages
</commit_message>
<xml_diff>
--- a/public/legal/orbit-systems-ai-terms-of-service.docx
+++ b/public/legal/orbit-systems-ai-terms-of-service.docx
@@ -636,6 +636,25 @@
     </w:p>
     <w:p>
       <w:pPr>
+        <w:pStyle w:val="Heading2"/>
+      </w:pPr>
+      <w:r>
+        <w:t>7.1 Children’s Privacy</w:t>
+      </w:r>
+    </w:p>
+    <w:p>
+      <w:pPr>
+        <w:keepLines w:val="0"/>
+      </w:pPr>
+      <w:r>
+        <w:rPr>
+          <w:i w:val="0"/>
+        </w:rPr>
+        <w:t>The Services are intended for business use and are not directed to children under 13. Customer must not configure or use the Services to solicit or knowingly collect personal information from children under 13 unless Orbit has expressly approved the use case in a written Order Form and the parties have implemented all legally required notices, verifiable parental-consent procedures, security measures, retention limits, and parental rights. Customer must promptly notify Orbit at legal@orbitsystems.ai if Customer believes a child’s personal information was collected improperly.</w:t>
+      </w:r>
+    </w:p>
+    <w:p>
+      <w:pPr>
         <w:pStyle w:val="Heading1"/>
       </w:pPr>
       <w:r>

</xml_diff>